<commit_message>
add mejora update bigdata
</commit_message>
<xml_diff>
--- a/bigdata/entregable/PIAD-625_FORMATOALUMNOTRABAJOFINAL.docx
+++ b/bigdata/entregable/PIAD-625_FORMATOALUMNOTRABAJOFINAL.docx
@@ -579,15 +579,7 @@
                 <w:sz w:val="20"/>
                 <w:szCs w:val="20"/>
               </w:rPr>
-              <w:t>V</w:t>
-            </w:r>
-            <w:r>
-              <w:rPr>
-                <w:rFonts w:ascii="Arial" w:hAnsi="Arial" w:cs="Arial"/>
-                <w:sz w:val="20"/>
-                <w:szCs w:val="20"/>
-              </w:rPr>
-              <w:t>I</w:t>
+              <w:t>VI</w:t>
             </w:r>
           </w:p>
         </w:tc>
@@ -680,88 +672,7 @@
                 <w:szCs w:val="20"/>
                 <w:lang w:val="es-PE"/>
               </w:rPr>
-              <w:t>B</w:t>
-            </w:r>
-            <w:r>
-              <w:rPr>
-                <w:rFonts w:ascii="Arial" w:hAnsi="Arial" w:cs="Arial"/>
-                <w:sz w:val="20"/>
-                <w:szCs w:val="20"/>
-                <w:lang w:val="es-PE"/>
-              </w:rPr>
-              <w:t xml:space="preserve">ig </w:t>
-            </w:r>
-            <w:r>
-              <w:rPr>
-                <w:rFonts w:ascii="Arial" w:hAnsi="Arial" w:cs="Arial"/>
-                <w:sz w:val="20"/>
-                <w:szCs w:val="20"/>
-                <w:lang w:val="es-PE"/>
-              </w:rPr>
-              <w:t>D</w:t>
-            </w:r>
-            <w:r>
-              <w:rPr>
-                <w:rFonts w:ascii="Arial" w:hAnsi="Arial" w:cs="Arial"/>
-                <w:sz w:val="20"/>
-                <w:szCs w:val="20"/>
-                <w:lang w:val="es-PE"/>
-              </w:rPr>
-              <w:t>ata</w:t>
-            </w:r>
-            <w:r>
-              <w:rPr>
-                <w:rFonts w:ascii="Arial" w:hAnsi="Arial" w:cs="Arial"/>
-                <w:sz w:val="20"/>
-                <w:szCs w:val="20"/>
-                <w:lang w:val="es-PE"/>
-              </w:rPr>
-              <w:t xml:space="preserve"> </w:t>
-            </w:r>
-            <w:r>
-              <w:rPr>
-                <w:rFonts w:ascii="Arial" w:hAnsi="Arial" w:cs="Arial"/>
-                <w:sz w:val="20"/>
-                <w:szCs w:val="20"/>
-                <w:lang w:val="es-PE"/>
-              </w:rPr>
-              <w:t>y</w:t>
-            </w:r>
-            <w:r>
-              <w:rPr>
-                <w:rFonts w:ascii="Arial" w:hAnsi="Arial" w:cs="Arial"/>
-                <w:sz w:val="20"/>
-                <w:szCs w:val="20"/>
-                <w:lang w:val="es-PE"/>
-              </w:rPr>
-              <w:t xml:space="preserve"> </w:t>
-            </w:r>
-            <w:r>
-              <w:rPr>
-                <w:rFonts w:ascii="Arial" w:hAnsi="Arial" w:cs="Arial"/>
-                <w:sz w:val="20"/>
-                <w:szCs w:val="20"/>
-                <w:lang w:val="es-PE"/>
-              </w:rPr>
-              <w:t>Análisis</w:t>
-            </w:r>
-            <w:r>
-              <w:rPr>
-                <w:rFonts w:ascii="Arial" w:hAnsi="Arial" w:cs="Arial"/>
-                <w:sz w:val="20"/>
-                <w:szCs w:val="20"/>
-                <w:lang w:val="es-PE"/>
-              </w:rPr>
-              <w:t xml:space="preserve"> </w:t>
-            </w:r>
-            <w:r>
-              <w:rPr>
-                <w:rFonts w:ascii="Arial" w:hAnsi="Arial" w:cs="Arial"/>
-                <w:sz w:val="20"/>
-                <w:szCs w:val="20"/>
-                <w:lang w:val="es-PE"/>
-              </w:rPr>
-              <w:t xml:space="preserve">de </w:t>
+              <w:t xml:space="preserve">Big Data y Análisis de </w:t>
             </w:r>
             <w:r>
               <w:rPr>
@@ -2066,9 +1977,38 @@
               <w:ind w:left="360"/>
               <w:rPr>
                 <w:rFonts w:ascii="Arial" w:hAnsi="Arial" w:cs="Arial"/>
+                <w:sz w:val="20"/>
+                <w:szCs w:val="20"/>
                 <w:lang w:val="es-PE"/>
               </w:rPr>
             </w:pPr>
+            <w:r>
+              <w:rPr>
+                <w:rFonts w:ascii="Arial" w:hAnsi="Arial" w:cs="Arial"/>
+                <w:sz w:val="20"/>
+                <w:szCs w:val="20"/>
+                <w:lang w:val="es-PE"/>
+              </w:rPr>
+              <w:t xml:space="preserve">¿Cuáles son las principales fuentes de datos masivos en </w:t>
+            </w:r>
+            <w:r>
+              <w:rPr>
+                <w:rFonts w:ascii="Arial" w:hAnsi="Arial" w:cs="Arial"/>
+                <w:sz w:val="20"/>
+                <w:szCs w:val="20"/>
+                <w:lang w:val="es-PE"/>
+              </w:rPr>
+              <w:t>el supermercado</w:t>
+            </w:r>
+            <w:r>
+              <w:rPr>
+                <w:rFonts w:ascii="Arial" w:hAnsi="Arial" w:cs="Arial"/>
+                <w:sz w:val="20"/>
+                <w:szCs w:val="20"/>
+                <w:lang w:val="es-PE"/>
+              </w:rPr>
+              <w:t xml:space="preserve"> y cómo pueden ser gestionadas de manera eficiente?</w:t>
+            </w:r>
           </w:p>
         </w:tc>
       </w:tr>
@@ -2181,7 +2121,25 @@
                 <w:szCs w:val="20"/>
                 <w:lang w:val="es-PE"/>
               </w:rPr>
-              <w:t> </w:t>
+              <w:t>¿Qué ventajas y desventajas tienen los diferentes sistemas de almacenamiento de datos masivos para</w:t>
+            </w:r>
+            <w:r>
+              <w:rPr>
+                <w:rFonts w:ascii="Arial" w:hAnsi="Arial" w:cs="Arial"/>
+                <w:sz w:val="20"/>
+                <w:szCs w:val="20"/>
+                <w:lang w:val="es-PE"/>
+              </w:rPr>
+              <w:t xml:space="preserve"> el supermercado</w:t>
+            </w:r>
+            <w:r>
+              <w:rPr>
+                <w:rFonts w:ascii="Arial" w:hAnsi="Arial" w:cs="Arial"/>
+                <w:sz w:val="20"/>
+                <w:szCs w:val="20"/>
+                <w:lang w:val="es-PE"/>
+              </w:rPr>
+              <w:t>?</w:t>
             </w:r>
           </w:p>
         </w:tc>
@@ -2298,7 +2256,25 @@
                 <w:szCs w:val="20"/>
                 <w:lang w:val="es-PE"/>
               </w:rPr>
-              <w:t> </w:t>
+              <w:t>¿Cuál es el framework de procesamiento de datos más adecuado para los objetivos de</w:t>
+            </w:r>
+            <w:r>
+              <w:rPr>
+                <w:rFonts w:ascii="Arial" w:hAnsi="Arial" w:cs="Arial"/>
+                <w:sz w:val="20"/>
+                <w:szCs w:val="20"/>
+                <w:lang w:val="es-PE"/>
+              </w:rPr>
+              <w:t xml:space="preserve">l supermercado </w:t>
+            </w:r>
+            <w:r>
+              <w:rPr>
+                <w:rFonts w:ascii="Arial" w:hAnsi="Arial" w:cs="Arial"/>
+                <w:sz w:val="20"/>
+                <w:szCs w:val="20"/>
+                <w:lang w:val="es-PE"/>
+              </w:rPr>
+              <w:t>y por qué?</w:t>
             </w:r>
           </w:p>
         </w:tc>
@@ -2414,7 +2390,25 @@
                 <w:szCs w:val="20"/>
                 <w:lang w:val="es-PE"/>
               </w:rPr>
-              <w:t> </w:t>
+              <w:t xml:space="preserve">¿Cómo se pueden aplicar herramientas de análisis de Big Data para mejorar la toma de decisiones empresariales en </w:t>
+            </w:r>
+            <w:r>
+              <w:rPr>
+                <w:rFonts w:ascii="Arial" w:hAnsi="Arial" w:cs="Arial"/>
+                <w:sz w:val="20"/>
+                <w:szCs w:val="20"/>
+                <w:lang w:val="es-PE"/>
+              </w:rPr>
+              <w:t>el supermercado</w:t>
+            </w:r>
+            <w:r>
+              <w:rPr>
+                <w:rFonts w:ascii="Arial" w:hAnsi="Arial" w:cs="Arial"/>
+                <w:sz w:val="20"/>
+                <w:szCs w:val="20"/>
+                <w:lang w:val="es-PE"/>
+              </w:rPr>
+              <w:t>?</w:t>
             </w:r>
           </w:p>
         </w:tc>
@@ -2515,6 +2509,9 @@
           <w:p>
             <w:pPr>
               <w:pStyle w:val="Prrafodelista"/>
+              <w:tabs>
+                <w:tab w:val="left" w:pos="2160"/>
+              </w:tabs>
               <w:ind w:left="360"/>
               <w:rPr>
                 <w:rFonts w:ascii="Arial" w:hAnsi="Arial" w:cs="Arial"/>
@@ -2530,7 +2527,36 @@
                 <w:szCs w:val="20"/>
                 <w:lang w:val="es-PE"/>
               </w:rPr>
-              <w:t> </w:t>
+              <w:t>¿Cuáles son los principales desafíos éticos y legales en la gestión de datos masivos dentro d</w:t>
+            </w:r>
+            <w:r>
+              <w:rPr>
+                <w:rFonts w:ascii="Arial" w:hAnsi="Arial" w:cs="Arial"/>
+                <w:sz w:val="20"/>
+                <w:szCs w:val="20"/>
+                <w:lang w:val="es-PE"/>
+              </w:rPr>
+              <w:t>el supermercado</w:t>
+            </w:r>
+            <w:bookmarkStart w:id="0" w:name="_GoBack"/>
+            <w:bookmarkEnd w:id="0"/>
+            <w:r>
+              <w:rPr>
+                <w:rFonts w:ascii="Arial" w:hAnsi="Arial" w:cs="Arial"/>
+                <w:sz w:val="20"/>
+                <w:szCs w:val="20"/>
+                <w:lang w:val="es-PE"/>
+              </w:rPr>
+              <w:t>?</w:t>
+            </w:r>
+            <w:r>
+              <w:rPr>
+                <w:rFonts w:ascii="Arial" w:hAnsi="Arial" w:cs="Arial"/>
+                <w:sz w:val="20"/>
+                <w:szCs w:val="20"/>
+                <w:lang w:val="es-PE"/>
+              </w:rPr>
+              <w:tab/>
             </w:r>
           </w:p>
         </w:tc>
@@ -2877,12 +2903,12 @@
       </w:tblPr>
       <w:tblGrid>
         <w:gridCol w:w="567"/>
-        <w:gridCol w:w="4194"/>
-        <w:gridCol w:w="715"/>
+        <w:gridCol w:w="4191"/>
+        <w:gridCol w:w="717"/>
+        <w:gridCol w:w="717"/>
+        <w:gridCol w:w="712"/>
         <w:gridCol w:w="713"/>
-        <w:gridCol w:w="713"/>
-        <w:gridCol w:w="714"/>
-        <w:gridCol w:w="719"/>
+        <w:gridCol w:w="718"/>
         <w:gridCol w:w="595"/>
       </w:tblGrid>
       <w:tr>
@@ -2922,7 +2948,7 @@
         </w:tc>
         <w:tc>
           <w:tcPr>
-            <w:tcW w:w="4194" w:type="dxa"/>
+            <w:tcW w:w="4191" w:type="dxa"/>
             <w:vMerge w:val="restart"/>
             <w:shd w:val="clear" w:color="auto" w:fill="C6D9F1" w:themeFill="text2" w:themeFillTint="33"/>
             <w:vAlign w:val="center"/>
@@ -2972,7 +2998,7 @@
         </w:tc>
         <w:tc>
           <w:tcPr>
-            <w:tcW w:w="4169" w:type="dxa"/>
+            <w:tcW w:w="4172" w:type="dxa"/>
             <w:gridSpan w:val="6"/>
             <w:shd w:val="clear" w:color="auto" w:fill="C6D9F1" w:themeFill="text2" w:themeFillTint="33"/>
             <w:vAlign w:val="center"/>
@@ -3025,7 +3051,7 @@
         </w:tc>
         <w:tc>
           <w:tcPr>
-            <w:tcW w:w="4194" w:type="dxa"/>
+            <w:tcW w:w="4191" w:type="dxa"/>
             <w:vMerge/>
             <w:vAlign w:val="center"/>
           </w:tcPr>
@@ -3042,7 +3068,43 @@
         </w:tc>
         <w:tc>
           <w:tcPr>
-            <w:tcW w:w="715" w:type="dxa"/>
+            <w:tcW w:w="717" w:type="dxa"/>
+            <w:shd w:val="clear" w:color="auto" w:fill="C6D9F1" w:themeFill="text2" w:themeFillTint="33"/>
+            <w:vAlign w:val="center"/>
+          </w:tcPr>
+          <w:p>
+            <w:pPr>
+              <w:jc w:val="center"/>
+              <w:rPr>
+                <w:rFonts w:ascii="Arial" w:hAnsi="Arial" w:cs="Arial"/>
+                <w:color w:val="0000FF"/>
+                <w:sz w:val="20"/>
+                <w:szCs w:val="20"/>
+              </w:rPr>
+            </w:pPr>
+          </w:p>
+        </w:tc>
+        <w:tc>
+          <w:tcPr>
+            <w:tcW w:w="717" w:type="dxa"/>
+            <w:shd w:val="clear" w:color="auto" w:fill="C6D9F1" w:themeFill="text2" w:themeFillTint="33"/>
+            <w:vAlign w:val="center"/>
+          </w:tcPr>
+          <w:p>
+            <w:pPr>
+              <w:jc w:val="center"/>
+              <w:rPr>
+                <w:rFonts w:ascii="Arial" w:hAnsi="Arial" w:cs="Arial"/>
+                <w:color w:val="0000FF"/>
+                <w:sz w:val="20"/>
+                <w:szCs w:val="20"/>
+              </w:rPr>
+            </w:pPr>
+          </w:p>
+        </w:tc>
+        <w:tc>
+          <w:tcPr>
+            <w:tcW w:w="712" w:type="dxa"/>
             <w:shd w:val="clear" w:color="auto" w:fill="C6D9F1" w:themeFill="text2" w:themeFillTint="33"/>
             <w:vAlign w:val="center"/>
           </w:tcPr>
@@ -3078,7 +3140,7 @@
         </w:tc>
         <w:tc>
           <w:tcPr>
-            <w:tcW w:w="713" w:type="dxa"/>
+            <w:tcW w:w="718" w:type="dxa"/>
             <w:shd w:val="clear" w:color="auto" w:fill="C6D9F1" w:themeFill="text2" w:themeFillTint="33"/>
             <w:vAlign w:val="center"/>
           </w:tcPr>
@@ -3096,43 +3158,7 @@
         </w:tc>
         <w:tc>
           <w:tcPr>
-            <w:tcW w:w="714" w:type="dxa"/>
-            <w:shd w:val="clear" w:color="auto" w:fill="C6D9F1" w:themeFill="text2" w:themeFillTint="33"/>
-            <w:vAlign w:val="center"/>
-          </w:tcPr>
-          <w:p>
-            <w:pPr>
-              <w:jc w:val="center"/>
-              <w:rPr>
-                <w:rFonts w:ascii="Arial" w:hAnsi="Arial" w:cs="Arial"/>
-                <w:color w:val="0000FF"/>
-                <w:sz w:val="20"/>
-                <w:szCs w:val="20"/>
-              </w:rPr>
-            </w:pPr>
-          </w:p>
-        </w:tc>
-        <w:tc>
-          <w:tcPr>
-            <w:tcW w:w="719" w:type="dxa"/>
-            <w:shd w:val="clear" w:color="auto" w:fill="C6D9F1" w:themeFill="text2" w:themeFillTint="33"/>
-            <w:vAlign w:val="center"/>
-          </w:tcPr>
-          <w:p>
-            <w:pPr>
-              <w:jc w:val="center"/>
-              <w:rPr>
-                <w:rFonts w:ascii="Arial" w:hAnsi="Arial" w:cs="Arial"/>
-                <w:color w:val="0000FF"/>
-                <w:sz w:val="20"/>
-                <w:szCs w:val="20"/>
-              </w:rPr>
-            </w:pPr>
-          </w:p>
-        </w:tc>
-        <w:tc>
-          <w:tcPr>
-            <w:tcW w:w="593" w:type="dxa"/>
+            <w:tcW w:w="595" w:type="dxa"/>
             <w:shd w:val="clear" w:color="auto" w:fill="C6D9F1" w:themeFill="text2" w:themeFillTint="33"/>
             <w:vAlign w:val="center"/>
           </w:tcPr>
@@ -3179,22 +3205,31 @@
         </w:tc>
         <w:tc>
           <w:tcPr>
-            <w:tcW w:w="4194" w:type="dxa"/>
-            <w:vAlign w:val="center"/>
-          </w:tcPr>
-          <w:p>
-            <w:pPr>
-              <w:rPr>
-                <w:rFonts w:ascii="Arial" w:hAnsi="Arial" w:cs="Arial"/>
-                <w:sz w:val="20"/>
-                <w:szCs w:val="20"/>
-              </w:rPr>
-            </w:pPr>
-          </w:p>
-        </w:tc>
-        <w:tc>
-          <w:tcPr>
-            <w:tcW w:w="715" w:type="dxa"/>
+            <w:tcW w:w="4191" w:type="dxa"/>
+            <w:vAlign w:val="center"/>
+          </w:tcPr>
+          <w:p>
+            <w:pPr>
+              <w:rPr>
+                <w:rFonts w:ascii="Arial" w:hAnsi="Arial" w:cs="Arial"/>
+                <w:sz w:val="20"/>
+                <w:szCs w:val="20"/>
+              </w:rPr>
+            </w:pPr>
+            <w:r>
+              <w:rPr>
+                <w:rFonts w:ascii="ArialMT" w:eastAsiaTheme="minorHAnsi" w:hAnsi="ArialMT" w:cs="ArialMT"/>
+                <w:sz w:val="20"/>
+                <w:szCs w:val="20"/>
+                <w:lang w:val="es-PE" w:eastAsia="en-US"/>
+              </w:rPr>
+              <w:t>PLANIFICAR</w:t>
+            </w:r>
+          </w:p>
+        </w:tc>
+        <w:tc>
+          <w:tcPr>
+            <w:tcW w:w="717" w:type="dxa"/>
             <w:vAlign w:val="center"/>
           </w:tcPr>
           <w:p>
@@ -3206,6 +3241,54 @@
                 <w:szCs w:val="20"/>
               </w:rPr>
             </w:pPr>
+            <w:r>
+              <w:rPr>
+                <w:rFonts w:ascii="Arial" w:hAnsi="Arial" w:cs="Arial"/>
+                <w:sz w:val="20"/>
+                <w:szCs w:val="20"/>
+              </w:rPr>
+              <w:t>18/05</w:t>
+            </w:r>
+          </w:p>
+        </w:tc>
+        <w:tc>
+          <w:tcPr>
+            <w:tcW w:w="717" w:type="dxa"/>
+            <w:vAlign w:val="center"/>
+          </w:tcPr>
+          <w:p>
+            <w:pPr>
+              <w:jc w:val="center"/>
+              <w:rPr>
+                <w:rFonts w:ascii="Arial" w:hAnsi="Arial" w:cs="Arial"/>
+                <w:sz w:val="20"/>
+                <w:szCs w:val="20"/>
+              </w:rPr>
+            </w:pPr>
+            <w:r>
+              <w:rPr>
+                <w:rFonts w:ascii="Arial" w:hAnsi="Arial" w:cs="Arial"/>
+                <w:sz w:val="20"/>
+                <w:szCs w:val="20"/>
+              </w:rPr>
+              <w:t>19/05</w:t>
+            </w:r>
+          </w:p>
+        </w:tc>
+        <w:tc>
+          <w:tcPr>
+            <w:tcW w:w="712" w:type="dxa"/>
+            <w:vAlign w:val="center"/>
+          </w:tcPr>
+          <w:p>
+            <w:pPr>
+              <w:jc w:val="center"/>
+              <w:rPr>
+                <w:rFonts w:ascii="Arial" w:hAnsi="Arial" w:cs="Arial"/>
+                <w:sz w:val="20"/>
+                <w:szCs w:val="20"/>
+              </w:rPr>
+            </w:pPr>
           </w:p>
         </w:tc>
         <w:tc>
@@ -3226,7 +3309,7 @@
         </w:tc>
         <w:tc>
           <w:tcPr>
-            <w:tcW w:w="713" w:type="dxa"/>
+            <w:tcW w:w="718" w:type="dxa"/>
             <w:vAlign w:val="center"/>
           </w:tcPr>
           <w:p>
@@ -3242,39 +3325,7 @@
         </w:tc>
         <w:tc>
           <w:tcPr>
-            <w:tcW w:w="714" w:type="dxa"/>
-            <w:vAlign w:val="center"/>
-          </w:tcPr>
-          <w:p>
-            <w:pPr>
-              <w:jc w:val="center"/>
-              <w:rPr>
-                <w:rFonts w:ascii="Arial" w:hAnsi="Arial" w:cs="Arial"/>
-                <w:sz w:val="20"/>
-                <w:szCs w:val="20"/>
-              </w:rPr>
-            </w:pPr>
-          </w:p>
-        </w:tc>
-        <w:tc>
-          <w:tcPr>
-            <w:tcW w:w="719" w:type="dxa"/>
-            <w:vAlign w:val="center"/>
-          </w:tcPr>
-          <w:p>
-            <w:pPr>
-              <w:jc w:val="center"/>
-              <w:rPr>
-                <w:rFonts w:ascii="Arial" w:hAnsi="Arial" w:cs="Arial"/>
-                <w:sz w:val="20"/>
-                <w:szCs w:val="20"/>
-              </w:rPr>
-            </w:pPr>
-          </w:p>
-        </w:tc>
-        <w:tc>
-          <w:tcPr>
-            <w:tcW w:w="593" w:type="dxa"/>
+            <w:tcW w:w="595" w:type="dxa"/>
             <w:vAlign w:val="center"/>
           </w:tcPr>
           <w:p>
@@ -3319,22 +3370,31 @@
         </w:tc>
         <w:tc>
           <w:tcPr>
-            <w:tcW w:w="4194" w:type="dxa"/>
-            <w:vAlign w:val="center"/>
-          </w:tcPr>
-          <w:p>
-            <w:pPr>
-              <w:rPr>
-                <w:rFonts w:ascii="Arial" w:hAnsi="Arial" w:cs="Arial"/>
-                <w:sz w:val="20"/>
-                <w:szCs w:val="20"/>
-              </w:rPr>
-            </w:pPr>
-          </w:p>
-        </w:tc>
-        <w:tc>
-          <w:tcPr>
-            <w:tcW w:w="715" w:type="dxa"/>
+            <w:tcW w:w="4191" w:type="dxa"/>
+            <w:vAlign w:val="center"/>
+          </w:tcPr>
+          <w:p>
+            <w:pPr>
+              <w:rPr>
+                <w:rFonts w:ascii="Arial" w:hAnsi="Arial" w:cs="Arial"/>
+                <w:sz w:val="20"/>
+                <w:szCs w:val="20"/>
+              </w:rPr>
+            </w:pPr>
+            <w:r>
+              <w:rPr>
+                <w:rFonts w:ascii="ArialMT" w:eastAsiaTheme="minorHAnsi" w:hAnsi="ArialMT" w:cs="ArialMT"/>
+                <w:sz w:val="20"/>
+                <w:szCs w:val="20"/>
+                <w:lang w:val="es-PE" w:eastAsia="en-US"/>
+              </w:rPr>
+              <w:t>INFORMAR</w:t>
+            </w:r>
+          </w:p>
+        </w:tc>
+        <w:tc>
+          <w:tcPr>
+            <w:tcW w:w="717" w:type="dxa"/>
             <w:vAlign w:val="center"/>
           </w:tcPr>
           <w:p>
@@ -3346,6 +3406,54 @@
                 <w:szCs w:val="20"/>
               </w:rPr>
             </w:pPr>
+            <w:r>
+              <w:rPr>
+                <w:rFonts w:ascii="Arial" w:hAnsi="Arial" w:cs="Arial"/>
+                <w:sz w:val="20"/>
+                <w:szCs w:val="20"/>
+              </w:rPr>
+              <w:t>21/05</w:t>
+            </w:r>
+          </w:p>
+        </w:tc>
+        <w:tc>
+          <w:tcPr>
+            <w:tcW w:w="717" w:type="dxa"/>
+            <w:vAlign w:val="center"/>
+          </w:tcPr>
+          <w:p>
+            <w:pPr>
+              <w:jc w:val="center"/>
+              <w:rPr>
+                <w:rFonts w:ascii="Arial" w:hAnsi="Arial" w:cs="Arial"/>
+                <w:sz w:val="20"/>
+                <w:szCs w:val="20"/>
+              </w:rPr>
+            </w:pPr>
+            <w:r>
+              <w:rPr>
+                <w:rFonts w:ascii="Arial" w:hAnsi="Arial" w:cs="Arial"/>
+                <w:sz w:val="20"/>
+                <w:szCs w:val="20"/>
+              </w:rPr>
+              <w:t>22/05</w:t>
+            </w:r>
+          </w:p>
+        </w:tc>
+        <w:tc>
+          <w:tcPr>
+            <w:tcW w:w="712" w:type="dxa"/>
+            <w:vAlign w:val="center"/>
+          </w:tcPr>
+          <w:p>
+            <w:pPr>
+              <w:jc w:val="center"/>
+              <w:rPr>
+                <w:rFonts w:ascii="Arial" w:hAnsi="Arial" w:cs="Arial"/>
+                <w:sz w:val="20"/>
+                <w:szCs w:val="20"/>
+              </w:rPr>
+            </w:pPr>
           </w:p>
         </w:tc>
         <w:tc>
@@ -3366,7 +3474,7 @@
         </w:tc>
         <w:tc>
           <w:tcPr>
-            <w:tcW w:w="713" w:type="dxa"/>
+            <w:tcW w:w="718" w:type="dxa"/>
             <w:vAlign w:val="center"/>
           </w:tcPr>
           <w:p>
@@ -3382,39 +3490,7 @@
         </w:tc>
         <w:tc>
           <w:tcPr>
-            <w:tcW w:w="714" w:type="dxa"/>
-            <w:vAlign w:val="center"/>
-          </w:tcPr>
-          <w:p>
-            <w:pPr>
-              <w:jc w:val="center"/>
-              <w:rPr>
-                <w:rFonts w:ascii="Arial" w:hAnsi="Arial" w:cs="Arial"/>
-                <w:sz w:val="20"/>
-                <w:szCs w:val="20"/>
-              </w:rPr>
-            </w:pPr>
-          </w:p>
-        </w:tc>
-        <w:tc>
-          <w:tcPr>
-            <w:tcW w:w="719" w:type="dxa"/>
-            <w:vAlign w:val="center"/>
-          </w:tcPr>
-          <w:p>
-            <w:pPr>
-              <w:jc w:val="center"/>
-              <w:rPr>
-                <w:rFonts w:ascii="Arial" w:hAnsi="Arial" w:cs="Arial"/>
-                <w:sz w:val="20"/>
-                <w:szCs w:val="20"/>
-              </w:rPr>
-            </w:pPr>
-          </w:p>
-        </w:tc>
-        <w:tc>
-          <w:tcPr>
-            <w:tcW w:w="593" w:type="dxa"/>
+            <w:tcW w:w="595" w:type="dxa"/>
             <w:vAlign w:val="center"/>
           </w:tcPr>
           <w:p>
@@ -3459,22 +3535,31 @@
         </w:tc>
         <w:tc>
           <w:tcPr>
-            <w:tcW w:w="4194" w:type="dxa"/>
-            <w:vAlign w:val="center"/>
-          </w:tcPr>
-          <w:p>
-            <w:pPr>
-              <w:rPr>
-                <w:rFonts w:ascii="Arial" w:hAnsi="Arial" w:cs="Arial"/>
-                <w:sz w:val="20"/>
-                <w:szCs w:val="20"/>
-              </w:rPr>
-            </w:pPr>
-          </w:p>
-        </w:tc>
-        <w:tc>
-          <w:tcPr>
-            <w:tcW w:w="715" w:type="dxa"/>
+            <w:tcW w:w="4191" w:type="dxa"/>
+            <w:vAlign w:val="center"/>
+          </w:tcPr>
+          <w:p>
+            <w:pPr>
+              <w:rPr>
+                <w:rFonts w:ascii="Arial" w:hAnsi="Arial" w:cs="Arial"/>
+                <w:sz w:val="20"/>
+                <w:szCs w:val="20"/>
+              </w:rPr>
+            </w:pPr>
+            <w:r>
+              <w:rPr>
+                <w:rFonts w:ascii="ArialMT" w:eastAsiaTheme="minorHAnsi" w:hAnsi="ArialMT" w:cs="ArialMT"/>
+                <w:sz w:val="20"/>
+                <w:szCs w:val="20"/>
+                <w:lang w:val="es-PE" w:eastAsia="en-US"/>
+              </w:rPr>
+              <w:t>DECIDIR</w:t>
+            </w:r>
+          </w:p>
+        </w:tc>
+        <w:tc>
+          <w:tcPr>
+            <w:tcW w:w="717" w:type="dxa"/>
             <w:vAlign w:val="center"/>
           </w:tcPr>
           <w:p>
@@ -3486,6 +3571,54 @@
                 <w:szCs w:val="20"/>
               </w:rPr>
             </w:pPr>
+            <w:r>
+              <w:rPr>
+                <w:rFonts w:ascii="Arial" w:hAnsi="Arial" w:cs="Arial"/>
+                <w:sz w:val="20"/>
+                <w:szCs w:val="20"/>
+              </w:rPr>
+              <w:t>23/05</w:t>
+            </w:r>
+          </w:p>
+        </w:tc>
+        <w:tc>
+          <w:tcPr>
+            <w:tcW w:w="717" w:type="dxa"/>
+            <w:vAlign w:val="center"/>
+          </w:tcPr>
+          <w:p>
+            <w:pPr>
+              <w:jc w:val="center"/>
+              <w:rPr>
+                <w:rFonts w:ascii="Arial" w:hAnsi="Arial" w:cs="Arial"/>
+                <w:sz w:val="20"/>
+                <w:szCs w:val="20"/>
+              </w:rPr>
+            </w:pPr>
+            <w:r>
+              <w:rPr>
+                <w:rFonts w:ascii="Arial" w:hAnsi="Arial" w:cs="Arial"/>
+                <w:sz w:val="20"/>
+                <w:szCs w:val="20"/>
+              </w:rPr>
+              <w:t>24/05</w:t>
+            </w:r>
+          </w:p>
+        </w:tc>
+        <w:tc>
+          <w:tcPr>
+            <w:tcW w:w="712" w:type="dxa"/>
+            <w:vAlign w:val="center"/>
+          </w:tcPr>
+          <w:p>
+            <w:pPr>
+              <w:jc w:val="center"/>
+              <w:rPr>
+                <w:rFonts w:ascii="Arial" w:hAnsi="Arial" w:cs="Arial"/>
+                <w:sz w:val="20"/>
+                <w:szCs w:val="20"/>
+              </w:rPr>
+            </w:pPr>
           </w:p>
         </w:tc>
         <w:tc>
@@ -3506,7 +3639,7 @@
         </w:tc>
         <w:tc>
           <w:tcPr>
-            <w:tcW w:w="713" w:type="dxa"/>
+            <w:tcW w:w="718" w:type="dxa"/>
             <w:vAlign w:val="center"/>
           </w:tcPr>
           <w:p>
@@ -3522,39 +3655,7 @@
         </w:tc>
         <w:tc>
           <w:tcPr>
-            <w:tcW w:w="714" w:type="dxa"/>
-            <w:vAlign w:val="center"/>
-          </w:tcPr>
-          <w:p>
-            <w:pPr>
-              <w:jc w:val="center"/>
-              <w:rPr>
-                <w:rFonts w:ascii="Arial" w:hAnsi="Arial" w:cs="Arial"/>
-                <w:sz w:val="20"/>
-                <w:szCs w:val="20"/>
-              </w:rPr>
-            </w:pPr>
-          </w:p>
-        </w:tc>
-        <w:tc>
-          <w:tcPr>
-            <w:tcW w:w="719" w:type="dxa"/>
-            <w:vAlign w:val="center"/>
-          </w:tcPr>
-          <w:p>
-            <w:pPr>
-              <w:jc w:val="center"/>
-              <w:rPr>
-                <w:rFonts w:ascii="Arial" w:hAnsi="Arial" w:cs="Arial"/>
-                <w:sz w:val="20"/>
-                <w:szCs w:val="20"/>
-              </w:rPr>
-            </w:pPr>
-          </w:p>
-        </w:tc>
-        <w:tc>
-          <w:tcPr>
-            <w:tcW w:w="593" w:type="dxa"/>
+            <w:tcW w:w="595" w:type="dxa"/>
             <w:vAlign w:val="center"/>
           </w:tcPr>
           <w:p>
@@ -3599,22 +3700,31 @@
         </w:tc>
         <w:tc>
           <w:tcPr>
-            <w:tcW w:w="4194" w:type="dxa"/>
-            <w:vAlign w:val="center"/>
-          </w:tcPr>
-          <w:p>
-            <w:pPr>
-              <w:rPr>
-                <w:rFonts w:ascii="Arial" w:hAnsi="Arial" w:cs="Arial"/>
-                <w:sz w:val="20"/>
-                <w:szCs w:val="20"/>
-              </w:rPr>
-            </w:pPr>
-          </w:p>
-        </w:tc>
-        <w:tc>
-          <w:tcPr>
-            <w:tcW w:w="715" w:type="dxa"/>
+            <w:tcW w:w="4191" w:type="dxa"/>
+            <w:vAlign w:val="center"/>
+          </w:tcPr>
+          <w:p>
+            <w:pPr>
+              <w:rPr>
+                <w:rFonts w:ascii="Arial" w:hAnsi="Arial" w:cs="Arial"/>
+                <w:sz w:val="20"/>
+                <w:szCs w:val="20"/>
+              </w:rPr>
+            </w:pPr>
+            <w:r>
+              <w:rPr>
+                <w:rFonts w:ascii="ArialMT" w:eastAsiaTheme="minorHAnsi" w:hAnsi="ArialMT" w:cs="ArialMT"/>
+                <w:sz w:val="20"/>
+                <w:szCs w:val="20"/>
+                <w:lang w:val="es-PE" w:eastAsia="en-US"/>
+              </w:rPr>
+              <w:t>REALIZAR</w:t>
+            </w:r>
+          </w:p>
+        </w:tc>
+        <w:tc>
+          <w:tcPr>
+            <w:tcW w:w="717" w:type="dxa"/>
             <w:vAlign w:val="center"/>
           </w:tcPr>
           <w:p>
@@ -3626,6 +3736,54 @@
                 <w:szCs w:val="20"/>
               </w:rPr>
             </w:pPr>
+            <w:r>
+              <w:rPr>
+                <w:rFonts w:ascii="Arial" w:hAnsi="Arial" w:cs="Arial"/>
+                <w:sz w:val="20"/>
+                <w:szCs w:val="20"/>
+              </w:rPr>
+              <w:t>25/05</w:t>
+            </w:r>
+          </w:p>
+        </w:tc>
+        <w:tc>
+          <w:tcPr>
+            <w:tcW w:w="717" w:type="dxa"/>
+            <w:vAlign w:val="center"/>
+          </w:tcPr>
+          <w:p>
+            <w:pPr>
+              <w:jc w:val="center"/>
+              <w:rPr>
+                <w:rFonts w:ascii="Arial" w:hAnsi="Arial" w:cs="Arial"/>
+                <w:sz w:val="20"/>
+                <w:szCs w:val="20"/>
+              </w:rPr>
+            </w:pPr>
+            <w:r>
+              <w:rPr>
+                <w:rFonts w:ascii="Arial" w:hAnsi="Arial" w:cs="Arial"/>
+                <w:sz w:val="20"/>
+                <w:szCs w:val="20"/>
+              </w:rPr>
+              <w:t>29/05</w:t>
+            </w:r>
+          </w:p>
+        </w:tc>
+        <w:tc>
+          <w:tcPr>
+            <w:tcW w:w="712" w:type="dxa"/>
+            <w:vAlign w:val="center"/>
+          </w:tcPr>
+          <w:p>
+            <w:pPr>
+              <w:jc w:val="center"/>
+              <w:rPr>
+                <w:rFonts w:ascii="Arial" w:hAnsi="Arial" w:cs="Arial"/>
+                <w:sz w:val="20"/>
+                <w:szCs w:val="20"/>
+              </w:rPr>
+            </w:pPr>
           </w:p>
         </w:tc>
         <w:tc>
@@ -3646,7 +3804,7 @@
         </w:tc>
         <w:tc>
           <w:tcPr>
-            <w:tcW w:w="713" w:type="dxa"/>
+            <w:tcW w:w="718" w:type="dxa"/>
             <w:vAlign w:val="center"/>
           </w:tcPr>
           <w:p>
@@ -3662,39 +3820,7 @@
         </w:tc>
         <w:tc>
           <w:tcPr>
-            <w:tcW w:w="714" w:type="dxa"/>
-            <w:vAlign w:val="center"/>
-          </w:tcPr>
-          <w:p>
-            <w:pPr>
-              <w:jc w:val="center"/>
-              <w:rPr>
-                <w:rFonts w:ascii="Arial" w:hAnsi="Arial" w:cs="Arial"/>
-                <w:sz w:val="20"/>
-                <w:szCs w:val="20"/>
-              </w:rPr>
-            </w:pPr>
-          </w:p>
-        </w:tc>
-        <w:tc>
-          <w:tcPr>
-            <w:tcW w:w="719" w:type="dxa"/>
-            <w:vAlign w:val="center"/>
-          </w:tcPr>
-          <w:p>
-            <w:pPr>
-              <w:jc w:val="center"/>
-              <w:rPr>
-                <w:rFonts w:ascii="Arial" w:hAnsi="Arial" w:cs="Arial"/>
-                <w:sz w:val="20"/>
-                <w:szCs w:val="20"/>
-              </w:rPr>
-            </w:pPr>
-          </w:p>
-        </w:tc>
-        <w:tc>
-          <w:tcPr>
-            <w:tcW w:w="593" w:type="dxa"/>
+            <w:tcW w:w="595" w:type="dxa"/>
             <w:vAlign w:val="center"/>
           </w:tcPr>
           <w:p>
@@ -3739,22 +3865,31 @@
         </w:tc>
         <w:tc>
           <w:tcPr>
-            <w:tcW w:w="4194" w:type="dxa"/>
-            <w:vAlign w:val="center"/>
-          </w:tcPr>
-          <w:p>
-            <w:pPr>
-              <w:rPr>
-                <w:rFonts w:ascii="Arial" w:hAnsi="Arial" w:cs="Arial"/>
-                <w:sz w:val="20"/>
-                <w:szCs w:val="20"/>
-              </w:rPr>
-            </w:pPr>
-          </w:p>
-        </w:tc>
-        <w:tc>
-          <w:tcPr>
-            <w:tcW w:w="715" w:type="dxa"/>
+            <w:tcW w:w="4191" w:type="dxa"/>
+            <w:vAlign w:val="center"/>
+          </w:tcPr>
+          <w:p>
+            <w:pPr>
+              <w:rPr>
+                <w:rFonts w:ascii="Arial" w:hAnsi="Arial" w:cs="Arial"/>
+                <w:sz w:val="20"/>
+                <w:szCs w:val="20"/>
+              </w:rPr>
+            </w:pPr>
+            <w:r>
+              <w:rPr>
+                <w:rFonts w:ascii="ArialMT" w:eastAsiaTheme="minorHAnsi" w:hAnsi="ArialMT" w:cs="ArialMT"/>
+                <w:sz w:val="20"/>
+                <w:szCs w:val="20"/>
+                <w:lang w:val="es-PE" w:eastAsia="en-US"/>
+              </w:rPr>
+              <w:t>CONTROLAR</w:t>
+            </w:r>
+          </w:p>
+        </w:tc>
+        <w:tc>
+          <w:tcPr>
+            <w:tcW w:w="717" w:type="dxa"/>
             <w:vAlign w:val="center"/>
           </w:tcPr>
           <w:p>
@@ -3766,6 +3901,54 @@
                 <w:szCs w:val="20"/>
               </w:rPr>
             </w:pPr>
+            <w:r>
+              <w:rPr>
+                <w:rFonts w:ascii="Arial" w:hAnsi="Arial" w:cs="Arial"/>
+                <w:sz w:val="20"/>
+                <w:szCs w:val="20"/>
+              </w:rPr>
+              <w:t>30/05</w:t>
+            </w:r>
+          </w:p>
+        </w:tc>
+        <w:tc>
+          <w:tcPr>
+            <w:tcW w:w="717" w:type="dxa"/>
+            <w:vAlign w:val="center"/>
+          </w:tcPr>
+          <w:p>
+            <w:pPr>
+              <w:jc w:val="center"/>
+              <w:rPr>
+                <w:rFonts w:ascii="Arial" w:hAnsi="Arial" w:cs="Arial"/>
+                <w:sz w:val="20"/>
+                <w:szCs w:val="20"/>
+              </w:rPr>
+            </w:pPr>
+            <w:r>
+              <w:rPr>
+                <w:rFonts w:ascii="Arial" w:hAnsi="Arial" w:cs="Arial"/>
+                <w:sz w:val="20"/>
+                <w:szCs w:val="20"/>
+              </w:rPr>
+              <w:t>01/06</w:t>
+            </w:r>
+          </w:p>
+        </w:tc>
+        <w:tc>
+          <w:tcPr>
+            <w:tcW w:w="712" w:type="dxa"/>
+            <w:vAlign w:val="center"/>
+          </w:tcPr>
+          <w:p>
+            <w:pPr>
+              <w:jc w:val="center"/>
+              <w:rPr>
+                <w:rFonts w:ascii="Arial" w:hAnsi="Arial" w:cs="Arial"/>
+                <w:sz w:val="20"/>
+                <w:szCs w:val="20"/>
+              </w:rPr>
+            </w:pPr>
           </w:p>
         </w:tc>
         <w:tc>
@@ -3786,7 +3969,7 @@
         </w:tc>
         <w:tc>
           <w:tcPr>
-            <w:tcW w:w="713" w:type="dxa"/>
+            <w:tcW w:w="718" w:type="dxa"/>
             <w:vAlign w:val="center"/>
           </w:tcPr>
           <w:p>
@@ -3802,39 +3985,7 @@
         </w:tc>
         <w:tc>
           <w:tcPr>
-            <w:tcW w:w="714" w:type="dxa"/>
-            <w:vAlign w:val="center"/>
-          </w:tcPr>
-          <w:p>
-            <w:pPr>
-              <w:jc w:val="center"/>
-              <w:rPr>
-                <w:rFonts w:ascii="Arial" w:hAnsi="Arial" w:cs="Arial"/>
-                <w:sz w:val="20"/>
-                <w:szCs w:val="20"/>
-              </w:rPr>
-            </w:pPr>
-          </w:p>
-        </w:tc>
-        <w:tc>
-          <w:tcPr>
-            <w:tcW w:w="719" w:type="dxa"/>
-            <w:vAlign w:val="center"/>
-          </w:tcPr>
-          <w:p>
-            <w:pPr>
-              <w:jc w:val="center"/>
-              <w:rPr>
-                <w:rFonts w:ascii="Arial" w:hAnsi="Arial" w:cs="Arial"/>
-                <w:sz w:val="20"/>
-                <w:szCs w:val="20"/>
-              </w:rPr>
-            </w:pPr>
-          </w:p>
-        </w:tc>
-        <w:tc>
-          <w:tcPr>
-            <w:tcW w:w="593" w:type="dxa"/>
+            <w:tcW w:w="595" w:type="dxa"/>
             <w:vAlign w:val="center"/>
           </w:tcPr>
           <w:p>
@@ -3867,34 +4018,26 @@
                 <w:szCs w:val="20"/>
               </w:rPr>
             </w:pPr>
-            <w:r>
-              <w:rPr>
-                <w:rFonts w:ascii="Arial" w:hAnsi="Arial" w:cs="Arial"/>
-                <w:sz w:val="20"/>
-                <w:szCs w:val="20"/>
-              </w:rPr>
-              <w:t>6</w:t>
-            </w:r>
-          </w:p>
-        </w:tc>
-        <w:tc>
-          <w:tcPr>
-            <w:tcW w:w="4194" w:type="dxa"/>
-            <w:vAlign w:val="center"/>
-          </w:tcPr>
-          <w:p>
-            <w:pPr>
-              <w:rPr>
-                <w:rFonts w:ascii="Arial" w:hAnsi="Arial" w:cs="Arial"/>
-                <w:sz w:val="20"/>
-                <w:szCs w:val="20"/>
-              </w:rPr>
-            </w:pPr>
-          </w:p>
-        </w:tc>
-        <w:tc>
-          <w:tcPr>
-            <w:tcW w:w="715" w:type="dxa"/>
+          </w:p>
+        </w:tc>
+        <w:tc>
+          <w:tcPr>
+            <w:tcW w:w="4191" w:type="dxa"/>
+            <w:vAlign w:val="center"/>
+          </w:tcPr>
+          <w:p>
+            <w:pPr>
+              <w:rPr>
+                <w:rFonts w:ascii="Arial" w:hAnsi="Arial" w:cs="Arial"/>
+                <w:sz w:val="20"/>
+                <w:szCs w:val="20"/>
+              </w:rPr>
+            </w:pPr>
+          </w:p>
+        </w:tc>
+        <w:tc>
+          <w:tcPr>
+            <w:tcW w:w="717" w:type="dxa"/>
             <w:vAlign w:val="center"/>
           </w:tcPr>
           <w:p>
@@ -3910,6 +4053,38 @@
         </w:tc>
         <w:tc>
           <w:tcPr>
+            <w:tcW w:w="717" w:type="dxa"/>
+            <w:vAlign w:val="center"/>
+          </w:tcPr>
+          <w:p>
+            <w:pPr>
+              <w:jc w:val="center"/>
+              <w:rPr>
+                <w:rFonts w:ascii="Arial" w:hAnsi="Arial" w:cs="Arial"/>
+                <w:sz w:val="20"/>
+                <w:szCs w:val="20"/>
+              </w:rPr>
+            </w:pPr>
+          </w:p>
+        </w:tc>
+        <w:tc>
+          <w:tcPr>
+            <w:tcW w:w="712" w:type="dxa"/>
+            <w:vAlign w:val="center"/>
+          </w:tcPr>
+          <w:p>
+            <w:pPr>
+              <w:jc w:val="center"/>
+              <w:rPr>
+                <w:rFonts w:ascii="Arial" w:hAnsi="Arial" w:cs="Arial"/>
+                <w:sz w:val="20"/>
+                <w:szCs w:val="20"/>
+              </w:rPr>
+            </w:pPr>
+          </w:p>
+        </w:tc>
+        <w:tc>
+          <w:tcPr>
             <w:tcW w:w="713" w:type="dxa"/>
             <w:vAlign w:val="center"/>
           </w:tcPr>
@@ -3926,7 +4101,7 @@
         </w:tc>
         <w:tc>
           <w:tcPr>
-            <w:tcW w:w="713" w:type="dxa"/>
+            <w:tcW w:w="718" w:type="dxa"/>
             <w:vAlign w:val="center"/>
           </w:tcPr>
           <w:p>
@@ -3942,39 +4117,7 @@
         </w:tc>
         <w:tc>
           <w:tcPr>
-            <w:tcW w:w="714" w:type="dxa"/>
-            <w:vAlign w:val="center"/>
-          </w:tcPr>
-          <w:p>
-            <w:pPr>
-              <w:jc w:val="center"/>
-              <w:rPr>
-                <w:rFonts w:ascii="Arial" w:hAnsi="Arial" w:cs="Arial"/>
-                <w:sz w:val="20"/>
-                <w:szCs w:val="20"/>
-              </w:rPr>
-            </w:pPr>
-          </w:p>
-        </w:tc>
-        <w:tc>
-          <w:tcPr>
-            <w:tcW w:w="719" w:type="dxa"/>
-            <w:vAlign w:val="center"/>
-          </w:tcPr>
-          <w:p>
-            <w:pPr>
-              <w:jc w:val="center"/>
-              <w:rPr>
-                <w:rFonts w:ascii="Arial" w:hAnsi="Arial" w:cs="Arial"/>
-                <w:sz w:val="20"/>
-                <w:szCs w:val="20"/>
-              </w:rPr>
-            </w:pPr>
-          </w:p>
-        </w:tc>
-        <w:tc>
-          <w:tcPr>
-            <w:tcW w:w="593" w:type="dxa"/>
+            <w:tcW w:w="595" w:type="dxa"/>
             <w:vAlign w:val="center"/>
           </w:tcPr>
           <w:p>
@@ -4202,6 +4345,12 @@
                 <w:rFonts w:ascii="Arial" w:hAnsi="Arial" w:cs="Arial"/>
               </w:rPr>
             </w:pPr>
+            <w:r>
+              <w:rPr>
+                <w:rFonts w:ascii="Arial" w:hAnsi="Arial" w:cs="Arial"/>
+              </w:rPr>
+              <w:t>Ordenador (PC)</w:t>
+            </w:r>
           </w:p>
         </w:tc>
         <w:tc>
@@ -4221,6 +4370,12 @@
                 <w:rFonts w:ascii="Arial" w:hAnsi="Arial" w:cs="Arial"/>
               </w:rPr>
             </w:pPr>
+            <w:r>
+              <w:rPr>
+                <w:rFonts w:ascii="Arial" w:hAnsi="Arial" w:cs="Arial"/>
+              </w:rPr>
+              <w:t>1</w:t>
+            </w:r>
           </w:p>
         </w:tc>
       </w:tr>
@@ -4248,6 +4403,13 @@
                 <w:spacing w:val="-3"/>
               </w:rPr>
             </w:pPr>
+            <w:r>
+              <w:rPr>
+                <w:rFonts w:ascii="Arial" w:hAnsi="Arial" w:cs="Arial"/>
+                <w:spacing w:val="-3"/>
+              </w:rPr>
+              <w:t>Celular</w:t>
+            </w:r>
           </w:p>
         </w:tc>
         <w:tc>
@@ -4268,6 +4430,12 @@
                 <w:szCs w:val="20"/>
               </w:rPr>
             </w:pPr>
+            <w:r>
+              <w:rPr>
+                <w:rFonts w:ascii="Arial" w:hAnsi="Arial" w:cs="Arial"/>
+              </w:rPr>
+              <w:t>1</w:t>
+            </w:r>
           </w:p>
         </w:tc>
       </w:tr>
@@ -4294,6 +4462,12 @@
                 <w:rFonts w:ascii="Arial" w:hAnsi="Arial" w:cs="Arial"/>
               </w:rPr>
             </w:pPr>
+            <w:r>
+              <w:rPr>
+                <w:rFonts w:ascii="Arial" w:hAnsi="Arial" w:cs="Arial"/>
+              </w:rPr>
+              <w:t>Monitor (24”)</w:t>
+            </w:r>
           </w:p>
         </w:tc>
         <w:tc>
@@ -4314,6 +4488,12 @@
                 <w:szCs w:val="20"/>
               </w:rPr>
             </w:pPr>
+            <w:r>
+              <w:rPr>
+                <w:rFonts w:ascii="Arial" w:hAnsi="Arial" w:cs="Arial"/>
+              </w:rPr>
+              <w:t>1</w:t>
+            </w:r>
           </w:p>
         </w:tc>
       </w:tr>
@@ -4340,6 +4520,12 @@
                 <w:rFonts w:ascii="Arial" w:hAnsi="Arial" w:cs="Arial"/>
               </w:rPr>
             </w:pPr>
+            <w:r>
+              <w:rPr>
+                <w:rFonts w:ascii="Arial" w:hAnsi="Arial" w:cs="Arial"/>
+              </w:rPr>
+              <w:t>USB (32 GB)</w:t>
+            </w:r>
           </w:p>
         </w:tc>
         <w:tc>
@@ -4360,6 +4546,12 @@
                 <w:szCs w:val="20"/>
               </w:rPr>
             </w:pPr>
+            <w:r>
+              <w:rPr>
+                <w:rFonts w:ascii="Arial" w:hAnsi="Arial" w:cs="Arial"/>
+              </w:rPr>
+              <w:t>1</w:t>
+            </w:r>
           </w:p>
         </w:tc>
       </w:tr>
@@ -4554,6 +4746,147 @@
               <w:rPr>
                 <w:rFonts w:ascii="Arial" w:hAnsi="Arial" w:cs="Arial"/>
                 <w:spacing w:val="-3"/>
+              </w:rPr>
+            </w:pPr>
+          </w:p>
+        </w:tc>
+        <w:tc>
+          <w:tcPr>
+            <w:tcW w:w="1275" w:type="dxa"/>
+            <w:tcBorders>
+              <w:top w:val="single" w:sz="4" w:space="0" w:color="auto"/>
+              <w:left w:val="single" w:sz="4" w:space="0" w:color="auto"/>
+              <w:bottom w:val="single" w:sz="4" w:space="0" w:color="auto"/>
+              <w:right w:val="single" w:sz="4" w:space="0" w:color="auto"/>
+            </w:tcBorders>
+          </w:tcPr>
+          <w:p>
+            <w:pPr>
+              <w:jc w:val="center"/>
+              <w:rPr>
+                <w:rFonts w:ascii="Arial" w:hAnsi="Arial" w:cs="Arial"/>
+                <w:szCs w:val="20"/>
+              </w:rPr>
+            </w:pPr>
+          </w:p>
+        </w:tc>
+      </w:tr>
+      <w:tr>
+        <w:tc>
+          <w:tcPr>
+            <w:tcW w:w="7792" w:type="dxa"/>
+            <w:tcBorders>
+              <w:top w:val="single" w:sz="4" w:space="0" w:color="auto"/>
+              <w:left w:val="single" w:sz="4" w:space="0" w:color="auto"/>
+              <w:bottom w:val="single" w:sz="4" w:space="0" w:color="auto"/>
+              <w:right w:val="single" w:sz="4" w:space="0" w:color="auto"/>
+            </w:tcBorders>
+          </w:tcPr>
+          <w:p>
+            <w:pPr>
+              <w:tabs>
+                <w:tab w:val="left" w:pos="-720"/>
+                <w:tab w:val="left" w:pos="0"/>
+              </w:tabs>
+              <w:suppressAutoHyphens/>
+              <w:ind w:left="171"/>
+              <w:jc w:val="both"/>
+              <w:rPr>
+                <w:rFonts w:ascii="Arial" w:hAnsi="Arial" w:cs="Arial"/>
+              </w:rPr>
+            </w:pPr>
+          </w:p>
+        </w:tc>
+        <w:tc>
+          <w:tcPr>
+            <w:tcW w:w="1275" w:type="dxa"/>
+            <w:tcBorders>
+              <w:top w:val="single" w:sz="4" w:space="0" w:color="auto"/>
+              <w:left w:val="single" w:sz="4" w:space="0" w:color="auto"/>
+              <w:bottom w:val="single" w:sz="4" w:space="0" w:color="auto"/>
+              <w:right w:val="single" w:sz="4" w:space="0" w:color="auto"/>
+            </w:tcBorders>
+          </w:tcPr>
+          <w:p>
+            <w:pPr>
+              <w:jc w:val="center"/>
+              <w:rPr>
+                <w:rFonts w:ascii="Arial" w:hAnsi="Arial" w:cs="Arial"/>
+                <w:szCs w:val="20"/>
+              </w:rPr>
+            </w:pPr>
+          </w:p>
+        </w:tc>
+      </w:tr>
+      <w:tr>
+        <w:tc>
+          <w:tcPr>
+            <w:tcW w:w="7792" w:type="dxa"/>
+            <w:tcBorders>
+              <w:top w:val="single" w:sz="4" w:space="0" w:color="auto"/>
+              <w:left w:val="single" w:sz="4" w:space="0" w:color="auto"/>
+              <w:bottom w:val="single" w:sz="4" w:space="0" w:color="auto"/>
+              <w:right w:val="single" w:sz="4" w:space="0" w:color="auto"/>
+            </w:tcBorders>
+          </w:tcPr>
+          <w:p>
+            <w:pPr>
+              <w:tabs>
+                <w:tab w:val="left" w:pos="-720"/>
+                <w:tab w:val="left" w:pos="0"/>
+              </w:tabs>
+              <w:suppressAutoHyphens/>
+              <w:ind w:left="171"/>
+              <w:jc w:val="both"/>
+              <w:rPr>
+                <w:rFonts w:ascii="Arial" w:hAnsi="Arial" w:cs="Arial"/>
+              </w:rPr>
+            </w:pPr>
+          </w:p>
+        </w:tc>
+        <w:tc>
+          <w:tcPr>
+            <w:tcW w:w="1275" w:type="dxa"/>
+            <w:tcBorders>
+              <w:top w:val="single" w:sz="4" w:space="0" w:color="auto"/>
+              <w:left w:val="single" w:sz="4" w:space="0" w:color="auto"/>
+              <w:bottom w:val="single" w:sz="4" w:space="0" w:color="auto"/>
+              <w:right w:val="single" w:sz="4" w:space="0" w:color="auto"/>
+            </w:tcBorders>
+          </w:tcPr>
+          <w:p>
+            <w:pPr>
+              <w:jc w:val="center"/>
+              <w:rPr>
+                <w:rFonts w:ascii="Arial" w:hAnsi="Arial" w:cs="Arial"/>
+                <w:szCs w:val="20"/>
+              </w:rPr>
+            </w:pPr>
+          </w:p>
+        </w:tc>
+      </w:tr>
+      <w:tr>
+        <w:tc>
+          <w:tcPr>
+            <w:tcW w:w="7792" w:type="dxa"/>
+            <w:tcBorders>
+              <w:top w:val="single" w:sz="4" w:space="0" w:color="auto"/>
+              <w:left w:val="single" w:sz="4" w:space="0" w:color="auto"/>
+              <w:bottom w:val="single" w:sz="4" w:space="0" w:color="auto"/>
+              <w:right w:val="single" w:sz="4" w:space="0" w:color="auto"/>
+            </w:tcBorders>
+          </w:tcPr>
+          <w:p>
+            <w:pPr>
+              <w:tabs>
+                <w:tab w:val="left" w:pos="-720"/>
+                <w:tab w:val="left" w:pos="0"/>
+              </w:tabs>
+              <w:suppressAutoHyphens/>
+              <w:ind w:left="171"/>
+              <w:jc w:val="both"/>
+              <w:rPr>
+                <w:rFonts w:ascii="Arial" w:hAnsi="Arial" w:cs="Arial"/>
               </w:rPr>
             </w:pPr>
           </w:p>
@@ -4825,11 +5158,21 @@
           </w:tcPr>
           <w:p>
             <w:pPr>
+              <w:tabs>
+                <w:tab w:val="left" w:pos="3240"/>
+              </w:tabs>
               <w:ind w:left="171"/>
               <w:rPr>
                 <w:rFonts w:ascii="Arial" w:hAnsi="Arial" w:cs="Arial"/>
               </w:rPr>
             </w:pPr>
+            <w:r>
+              <w:rPr>
+                <w:rFonts w:ascii="ArialMT" w:eastAsiaTheme="minorHAnsi" w:hAnsi="ArialMT" w:cs="ArialMT"/>
+                <w:lang w:val="es-PE" w:eastAsia="en-US"/>
+              </w:rPr>
+              <w:t>Lentes</w:t>
+            </w:r>
           </w:p>
         </w:tc>
         <w:tc>
@@ -4849,6 +5192,12 @@
                 <w:rFonts w:ascii="Arial" w:hAnsi="Arial" w:cs="Arial"/>
               </w:rPr>
             </w:pPr>
+            <w:r>
+              <w:rPr>
+                <w:rFonts w:ascii="Arial" w:hAnsi="Arial" w:cs="Arial"/>
+              </w:rPr>
+              <w:t>1</w:t>
+            </w:r>
           </w:p>
         </w:tc>
       </w:tr>
@@ -4877,6 +5226,13 @@
                 <w:spacing w:val="-3"/>
               </w:rPr>
             </w:pPr>
+            <w:r>
+              <w:rPr>
+                <w:rFonts w:ascii="Arial" w:hAnsi="Arial" w:cs="Arial"/>
+                <w:spacing w:val="-3"/>
+              </w:rPr>
+              <w:t>Botella de agua</w:t>
+            </w:r>
           </w:p>
         </w:tc>
         <w:tc>
@@ -4897,6 +5253,13 @@
                 <w:szCs w:val="20"/>
               </w:rPr>
             </w:pPr>
+            <w:r>
+              <w:rPr>
+                <w:rFonts w:ascii="Arial" w:hAnsi="Arial" w:cs="Arial"/>
+                <w:szCs w:val="20"/>
+              </w:rPr>
+              <w:t>6</w:t>
+            </w:r>
           </w:p>
         </w:tc>
       </w:tr>
@@ -4924,6 +5287,12 @@
                 <w:rFonts w:ascii="Arial" w:hAnsi="Arial" w:cs="Arial"/>
               </w:rPr>
             </w:pPr>
+            <w:r>
+              <w:rPr>
+                <w:rFonts w:ascii="Arial" w:hAnsi="Arial" w:cs="Arial"/>
+              </w:rPr>
+              <w:t>Cargador</w:t>
+            </w:r>
           </w:p>
         </w:tc>
         <w:tc>
@@ -4944,6 +5313,13 @@
                 <w:szCs w:val="20"/>
               </w:rPr>
             </w:pPr>
+            <w:r>
+              <w:rPr>
+                <w:rFonts w:ascii="Arial" w:hAnsi="Arial" w:cs="Arial"/>
+                <w:szCs w:val="20"/>
+              </w:rPr>
+              <w:t>1</w:t>
+            </w:r>
           </w:p>
         </w:tc>
       </w:tr>
@@ -4971,6 +5347,12 @@
                 <w:rFonts w:ascii="Arial" w:hAnsi="Arial" w:cs="Arial"/>
               </w:rPr>
             </w:pPr>
+            <w:r>
+              <w:rPr>
+                <w:rFonts w:ascii="Arial" w:hAnsi="Arial" w:cs="Arial"/>
+              </w:rPr>
+              <w:t>Audífonos</w:t>
+            </w:r>
           </w:p>
         </w:tc>
         <w:tc>
@@ -4991,6 +5373,13 @@
                 <w:szCs w:val="20"/>
               </w:rPr>
             </w:pPr>
+            <w:r>
+              <w:rPr>
+                <w:rFonts w:ascii="Arial" w:hAnsi="Arial" w:cs="Arial"/>
+                <w:szCs w:val="20"/>
+              </w:rPr>
+              <w:t>2</w:t>
+            </w:r>
           </w:p>
         </w:tc>
       </w:tr>
@@ -5299,7 +5688,7 @@
                 <w:szCs w:val="20"/>
               </w:rPr>
             </w:pPr>
-            <w:bookmarkStart w:id="0" w:name="_Hlk178943252"/>
+            <w:bookmarkStart w:id="1" w:name="_Hlk178943252"/>
             <w:r>
               <w:rPr>
                 <w:rFonts w:ascii="Arial" w:hAnsi="Arial" w:cs="Arial"/>
@@ -5674,7 +6063,7 @@
           </w:p>
         </w:tc>
       </w:tr>
-      <w:bookmarkEnd w:id="0"/>
+      <w:bookmarkEnd w:id="1"/>
     </w:tbl>
     <w:p>
       <w:pPr>
@@ -7005,7 +7394,7 @@
                 <w:color w:val="BFBFBF" w:themeColor="background1" w:themeShade="BF"/>
                 <w:sz w:val="22"/>
               </w:rPr>
-              <w:t>FLORES QUISPE DUILIO OMAR</w:t>
+              <w:t>Flores Quispe Duilio Omar</w:t>
             </w:r>
             <w:r>
               <w:rPr>
@@ -8965,7 +9354,7 @@
               </wp:anchor>
             </w:drawing>
           </mc:Choice>
-          <mc:Fallback xmlns:w16sdtdh="http://schemas.microsoft.com/office/word/2020/wordml/sdtdatahash" xmlns:w16du="http://schemas.microsoft.com/office/word/2023/wordml/word16du" xmlns:w16="http://schemas.microsoft.com/office/word/2018/wordml" xmlns:w16cex="http://schemas.microsoft.com/office/word/2018/wordml/cex" xmlns:oel="http://schemas.microsoft.com/office/2019/extlst">
+          <mc:Fallback xmlns:oel="http://schemas.microsoft.com/office/2019/extlst" xmlns:w16cex="http://schemas.microsoft.com/office/word/2018/wordml/cex" xmlns:w16="http://schemas.microsoft.com/office/word/2018/wordml" xmlns:w16du="http://schemas.microsoft.com/office/word/2023/wordml/word16du" xmlns:w16sdtdh="http://schemas.microsoft.com/office/word/2020/wordml/sdtdatahash">
             <w:pict>
               <v:rect w14:anchorId="633487F7" id="Rectángulo 3" o:spid="_x0000_s1026" style="position:absolute;margin-left:-8.65pt;margin-top:249.25pt;width:616.5pt;height:840.55pt;z-index:251709440;visibility:visible;mso-wrap-style:square;mso-width-percent:0;mso-height-percent:0;mso-wrap-distance-left:9pt;mso-wrap-distance-top:0;mso-wrap-distance-right:9pt;mso-wrap-distance-bottom:0;mso-position-horizontal:absolute;mso-position-horizontal-relative:page;mso-position-vertical:absolute;mso-position-vertical-relative:text;mso-width-percent:0;mso-height-percent:0;mso-width-relative:margin;mso-height-relative:margin;v-text-anchor:middle" o:gfxdata="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" fillcolor="white [3212]" stroked="f" strokeweight="2pt">
                 <w10:wrap anchorx="page"/>
@@ -9890,8 +10279,6 @@
           <w:docGrid w:linePitch="360"/>
         </w:sectPr>
       </w:pPr>
-      <w:bookmarkStart w:id="1" w:name="_GoBack"/>
-      <w:bookmarkEnd w:id="1"/>
     </w:p>
     <w:p>
       <w:pPr>
@@ -12573,38 +12960,6 @@
 </file>
 
 <file path=customXml/item1.xml><?xml version="1.0" encoding="utf-8"?>
-<p:properties xmlns:p="http://schemas.microsoft.com/office/2006/metadata/properties" xmlns:xsi="http://www.w3.org/2001/XMLSchema-instance" xmlns:pc="http://schemas.microsoft.com/office/infopath/2007/PartnerControls">
-  <documentManagement>
-    <TaxCatchAll xmlns="ee27a0f9-7ff9-4c05-b61a-f7053cc3ff56" xsi:nil="true"/>
-    <lcf76f155ced4ddcb4097134ff3c332f xmlns="8b0498ea-4bc6-4676-a87b-9cffe7f59fc7">
-      <Terms xmlns="http://schemas.microsoft.com/office/infopath/2007/PartnerControls"/>
-    </lcf76f155ced4ddcb4097134ff3c332f>
-    <Entregado xmlns="8b0498ea-4bc6-4676-a87b-9cffe7f59fc7">false</Entregado>
-    <Tarea3 xmlns="8b0498ea-4bc6-4676-a87b-9cffe7f59fc7" xsi:nil="true"/>
-    <NumTareas xmlns="8b0498ea-4bc6-4676-a87b-9cffe7f59fc7" xsi:nil="true"/>
-    <FECHAYHORA xmlns="8b0498ea-4bc6-4676-a87b-9cffe7f59fc7" xsi:nil="true"/>
-    <Observado xmlns="8b0498ea-4bc6-4676-a87b-9cffe7f59fc7">false</Observado>
-    <SharedWithUsers xmlns="ee27a0f9-7ff9-4c05-b61a-f7053cc3ff56">
-      <UserInfo>
-        <DisplayName/>
-        <AccountId xsi:nil="true"/>
-        <AccountType/>
-      </UserInfo>
-    </SharedWithUsers>
-  </documentManagement>
-</p:properties>
-</file>
-
-<file path=customXml/item2.xml><?xml version="1.0" encoding="utf-8"?>
-<?mso-contentType ?>
-<FormTemplates xmlns="http://schemas.microsoft.com/sharepoint/v3/contenttype/forms">
-  <Display>DocumentLibraryForm</Display>
-  <Edit>DocumentLibraryForm</Edit>
-  <New>DocumentLibraryForm</New>
-</FormTemplates>
-</file>
-
-<file path=customXml/item3.xml><?xml version="1.0" encoding="utf-8"?>
 <ct:contentTypeSchema xmlns:ct="http://schemas.microsoft.com/office/2006/metadata/contentType" xmlns:ma="http://schemas.microsoft.com/office/2006/metadata/properties/metaAttributes" ct:_="" ma:_="" ma:contentTypeName="Document" ma:contentTypeID="0x010100795EFC9A07ECD140851F1B2ABF131888" ma:contentTypeVersion="42" ma:contentTypeDescription="Create a new document." ma:contentTypeScope="" ma:versionID="68705ce6714181f4c3a7778789206999">
   <xsd:schema xmlns:xsd="http://www.w3.org/2001/XMLSchema" xmlns:xs="http://www.w3.org/2001/XMLSchema" xmlns:p="http://schemas.microsoft.com/office/2006/metadata/properties" xmlns:ns2="8b0498ea-4bc6-4676-a87b-9cffe7f59fc7" xmlns:ns3="ee27a0f9-7ff9-4c05-b61a-f7053cc3ff56" targetNamespace="http://schemas.microsoft.com/office/2006/metadata/properties" ma:root="true" ma:fieldsID="837849ccf018e896f9c9e07cfaff02ef" ns2:_="" ns3:_="">
     <xsd:import namespace="8b0498ea-4bc6-4676-a87b-9cffe7f59fc7"/>
@@ -12900,30 +13255,43 @@
 </ct:contentTypeSchema>
 </file>
 
+<file path=customXml/item2.xml><?xml version="1.0" encoding="utf-8"?>
+<?mso-contentType ?>
+<FormTemplates xmlns="http://schemas.microsoft.com/sharepoint/v3/contenttype/forms">
+  <Display>DocumentLibraryForm</Display>
+  <Edit>DocumentLibraryForm</Edit>
+  <New>DocumentLibraryForm</New>
+</FormTemplates>
+</file>
+
+<file path=customXml/item3.xml><?xml version="1.0" encoding="utf-8"?>
+<p:properties xmlns:p="http://schemas.microsoft.com/office/2006/metadata/properties" xmlns:xsi="http://www.w3.org/2001/XMLSchema-instance" xmlns:pc="http://schemas.microsoft.com/office/infopath/2007/PartnerControls">
+  <documentManagement>
+    <TaxCatchAll xmlns="ee27a0f9-7ff9-4c05-b61a-f7053cc3ff56" xsi:nil="true"/>
+    <lcf76f155ced4ddcb4097134ff3c332f xmlns="8b0498ea-4bc6-4676-a87b-9cffe7f59fc7">
+      <Terms xmlns="http://schemas.microsoft.com/office/infopath/2007/PartnerControls"/>
+    </lcf76f155ced4ddcb4097134ff3c332f>
+    <Entregado xmlns="8b0498ea-4bc6-4676-a87b-9cffe7f59fc7">false</Entregado>
+    <Tarea3 xmlns="8b0498ea-4bc6-4676-a87b-9cffe7f59fc7" xsi:nil="true"/>
+    <NumTareas xmlns="8b0498ea-4bc6-4676-a87b-9cffe7f59fc7" xsi:nil="true"/>
+    <FECHAYHORA xmlns="8b0498ea-4bc6-4676-a87b-9cffe7f59fc7" xsi:nil="true"/>
+    <Observado xmlns="8b0498ea-4bc6-4676-a87b-9cffe7f59fc7">false</Observado>
+    <SharedWithUsers xmlns="ee27a0f9-7ff9-4c05-b61a-f7053cc3ff56">
+      <UserInfo>
+        <DisplayName/>
+        <AccountId xsi:nil="true"/>
+        <AccountType/>
+      </UserInfo>
+    </SharedWithUsers>
+  </documentManagement>
+</p:properties>
+</file>
+
 <file path=customXml/item4.xml><?xml version="1.0" encoding="utf-8"?>
 <b:Sources xmlns:b="http://schemas.openxmlformats.org/officeDocument/2006/bibliography" xmlns="http://schemas.openxmlformats.org/officeDocument/2006/bibliography" SelectedStyle="\APA.XSL" StyleName="APA"/>
 </file>
 
 <file path=customXml/itemProps1.xml><?xml version="1.0" encoding="utf-8"?>
-<ds:datastoreItem xmlns:ds="http://schemas.openxmlformats.org/officeDocument/2006/customXml" ds:itemID="{BF77E685-4CE1-49EA-B15D-526260D8588E}">
-  <ds:schemaRefs>
-    <ds:schemaRef ds:uri="http://schemas.microsoft.com/office/2006/metadata/properties"/>
-    <ds:schemaRef ds:uri="http://schemas.microsoft.com/office/infopath/2007/PartnerControls"/>
-    <ds:schemaRef ds:uri="ee27a0f9-7ff9-4c05-b61a-f7053cc3ff56"/>
-    <ds:schemaRef ds:uri="8b0498ea-4bc6-4676-a87b-9cffe7f59fc7"/>
-  </ds:schemaRefs>
-</ds:datastoreItem>
-</file>
-
-<file path=customXml/itemProps2.xml><?xml version="1.0" encoding="utf-8"?>
-<ds:datastoreItem xmlns:ds="http://schemas.openxmlformats.org/officeDocument/2006/customXml" ds:itemID="{04A08A2F-85C4-4058-B79A-F3E79FBC01F5}">
-  <ds:schemaRefs>
-    <ds:schemaRef ds:uri="http://schemas.microsoft.com/sharepoint/v3/contenttype/forms"/>
-  </ds:schemaRefs>
-</ds:datastoreItem>
-</file>
-
-<file path=customXml/itemProps3.xml><?xml version="1.0" encoding="utf-8"?>
 <ds:datastoreItem xmlns:ds="http://schemas.openxmlformats.org/officeDocument/2006/customXml" ds:itemID="{5A632AF9-A9DA-4C5B-AE0A-CE3748046D44}">
   <ds:schemaRefs>
     <ds:schemaRef ds:uri="http://schemas.microsoft.com/office/2006/metadata/contentType"/>
@@ -12942,8 +13310,27 @@
 </ds:datastoreItem>
 </file>
 
+<file path=customXml/itemProps2.xml><?xml version="1.0" encoding="utf-8"?>
+<ds:datastoreItem xmlns:ds="http://schemas.openxmlformats.org/officeDocument/2006/customXml" ds:itemID="{04A08A2F-85C4-4058-B79A-F3E79FBC01F5}">
+  <ds:schemaRefs>
+    <ds:schemaRef ds:uri="http://schemas.microsoft.com/sharepoint/v3/contenttype/forms"/>
+  </ds:schemaRefs>
+</ds:datastoreItem>
+</file>
+
+<file path=customXml/itemProps3.xml><?xml version="1.0" encoding="utf-8"?>
+<ds:datastoreItem xmlns:ds="http://schemas.openxmlformats.org/officeDocument/2006/customXml" ds:itemID="{BF77E685-4CE1-49EA-B15D-526260D8588E}">
+  <ds:schemaRefs>
+    <ds:schemaRef ds:uri="http://schemas.microsoft.com/office/2006/metadata/properties"/>
+    <ds:schemaRef ds:uri="http://schemas.microsoft.com/office/infopath/2007/PartnerControls"/>
+    <ds:schemaRef ds:uri="ee27a0f9-7ff9-4c05-b61a-f7053cc3ff56"/>
+    <ds:schemaRef ds:uri="8b0498ea-4bc6-4676-a87b-9cffe7f59fc7"/>
+  </ds:schemaRefs>
+</ds:datastoreItem>
+</file>
+
 <file path=customXml/itemProps4.xml><?xml version="1.0" encoding="utf-8"?>
-<ds:datastoreItem xmlns:ds="http://schemas.openxmlformats.org/officeDocument/2006/customXml" ds:itemID="{54A40A51-9E84-41ED-BA86-339282BEAACD}">
+<ds:datastoreItem xmlns:ds="http://schemas.openxmlformats.org/officeDocument/2006/customXml" ds:itemID="{D5F5289B-A6A5-4F90-B3EC-62DFE66CE97A}">
   <ds:schemaRefs>
     <ds:schemaRef ds:uri="http://schemas.openxmlformats.org/officeDocument/2006/bibliography"/>
   </ds:schemaRefs>

</xml_diff>